<commit_message>
refactor: update portfolio project descriptions, add resume PDF, and ignore local document files.
</commit_message>
<xml_diff>
--- a/SwaromResume.docx
+++ b/SwaromResume.docx
@@ -77,7 +77,7 @@
           </mc:Choice>
           <mc:Fallback>
             <w:pict>
-              <v:shape w14:anchorId="045FADBC" id="Graphic 1" o:spid="_x0000_s1026" style="position:absolute;margin-left:55.65pt;margin-top:120.9pt;width:499.65pt;height:.1pt;z-index:15728640;visibility:visible;mso-wrap-style:square;mso-wrap-distance-left:0;mso-wrap-distance-top:0;mso-wrap-distance-right:0;mso-wrap-distance-bottom:0;mso-position-horizontal:absolute;mso-position-horizontal-relative:page;mso-position-vertical:absolute;mso-position-vertical-relative:page;v-text-anchor:top" coordsize="6345555,1270" o:gfxdata="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" path="m,l6345047,e" filled="f" strokeweight=".14033mm">
+              <v:shape w14:anchorId="35CDA99A" id="Graphic 1" o:spid="_x0000_s1026" style="position:absolute;margin-left:55.65pt;margin-top:120.9pt;width:499.65pt;height:.1pt;z-index:15728640;visibility:visible;mso-wrap-style:square;mso-wrap-distance-left:0;mso-wrap-distance-top:0;mso-wrap-distance-right:0;mso-wrap-distance-bottom:0;mso-position-horizontal:absolute;mso-position-horizontal-relative:page;mso-position-vertical:absolute;mso-position-vertical-relative:page;v-text-anchor:top" coordsize="6345555,1270" o:gfxdata="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" path="m,l6345047,e" filled="f" strokeweight=".14033mm">
                 <v:path arrowok="t"/>
                 <w10:wrap anchorx="page" anchory="page"/>
               </v:shape>
@@ -88,12 +88,14 @@
       <w:r>
         <w:t xml:space="preserve">Swarom </w:t>
       </w:r>
+      <w:proofErr w:type="spellStart"/>
       <w:r>
         <w:rPr>
           <w:spacing w:val="-2"/>
         </w:rPr>
         <w:t>Firagannavar</w:t>
       </w:r>
+      <w:proofErr w:type="spellEnd"/>
     </w:p>
     <w:p>
       <w:pPr>
@@ -466,7 +468,7 @@
           </mc:Choice>
           <mc:Fallback>
             <w:pict>
-              <v:shape w14:anchorId="2DDB7291" id="Graphic 2" o:spid="_x0000_s1026" style="position:absolute;margin-left:56.05pt;margin-top:215.35pt;width:499.65pt;height:.1pt;z-index:251655168;visibility:visible;mso-wrap-style:square;mso-wrap-distance-left:0;mso-wrap-distance-top:0;mso-wrap-distance-right:0;mso-wrap-distance-bottom:0;mso-position-horizontal:absolute;mso-position-horizontal-relative:page;mso-position-vertical:absolute;mso-position-vertical-relative:page;v-text-anchor:top" coordsize="6345555,1270" o:gfxdata="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" path="m,l6345046,e" filled="f" strokeweight=".14033mm">
+              <v:shape w14:anchorId="2E1BA60F" id="Graphic 2" o:spid="_x0000_s1026" style="position:absolute;margin-left:56.05pt;margin-top:215.35pt;width:499.65pt;height:.1pt;z-index:251655168;visibility:visible;mso-wrap-style:square;mso-wrap-distance-left:0;mso-wrap-distance-top:0;mso-wrap-distance-right:0;mso-wrap-distance-bottom:0;mso-position-horizontal:absolute;mso-position-horizontal-relative:page;mso-position-vertical:absolute;mso-position-vertical-relative:page;v-text-anchor:top" coordsize="6345555,1270" o:gfxdata="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" path="m,l6345046,e" filled="f" strokeweight=".14033mm">
                 <v:path arrowok="t"/>
                 <w10:wrap anchorx="page" anchory="page"/>
               </v:shape>
@@ -595,11 +597,19 @@
         </w:rPr>
         <w:t xml:space="preserve"> </w:t>
       </w:r>
-      <w:r>
-        <w:rPr>
-          <w:sz w:val="20"/>
-        </w:rPr>
-        <w:t>FastAPI,</w:t>
+      <w:proofErr w:type="spellStart"/>
+      <w:r>
+        <w:rPr>
+          <w:sz w:val="20"/>
+        </w:rPr>
+        <w:t>FastAPI</w:t>
+      </w:r>
+      <w:proofErr w:type="spellEnd"/>
+      <w:r>
+        <w:rPr>
+          <w:sz w:val="20"/>
+        </w:rPr>
+        <w:t>,</w:t>
       </w:r>
       <w:r>
         <w:rPr>
@@ -621,6 +631,7 @@
         </w:rPr>
         <w:t xml:space="preserve"> </w:t>
       </w:r>
+      <w:proofErr w:type="spellStart"/>
       <w:r>
         <w:rPr>
           <w:spacing w:val="-4"/>
@@ -628,6 +639,7 @@
         </w:rPr>
         <w:t>Keras</w:t>
       </w:r>
+      <w:proofErr w:type="spellEnd"/>
     </w:p>
     <w:p>
       <w:pPr>
@@ -788,7 +800,23 @@
           <w:spacing w:val="-2"/>
           <w:sz w:val="20"/>
         </w:rPr>
-        <w:t>(Firestore)</w:t>
+        <w:t>(</w:t>
+      </w:r>
+      <w:proofErr w:type="spellStart"/>
+      <w:r>
+        <w:rPr>
+          <w:spacing w:val="-2"/>
+          <w:sz w:val="20"/>
+        </w:rPr>
+        <w:t>Firestore</w:t>
+      </w:r>
+      <w:proofErr w:type="spellEnd"/>
+      <w:r>
+        <w:rPr>
+          <w:spacing w:val="-2"/>
+          <w:sz w:val="20"/>
+        </w:rPr>
+        <w:t>)</w:t>
       </w:r>
     </w:p>
     <w:p>
@@ -1064,7 +1092,7 @@
           </mc:Choice>
           <mc:Fallback>
             <w:pict>
-              <v:shape w14:anchorId="52677864" id="Graphic 3" o:spid="_x0000_s1026" style="position:absolute;margin-left:55.6pt;margin-top:341.35pt;width:499.65pt;height:.1pt;z-index:251659264;visibility:visible;mso-wrap-style:square;mso-wrap-distance-left:0;mso-wrap-distance-top:0;mso-wrap-distance-right:0;mso-wrap-distance-bottom:0;mso-position-horizontal:absolute;mso-position-horizontal-relative:page;mso-position-vertical:absolute;mso-position-vertical-relative:page;v-text-anchor:top" coordsize="6345555,1270" o:gfxdata="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" path="m,l6345047,e" filled="f" strokeweight=".14033mm">
+              <v:shape w14:anchorId="7B64AAC5" id="Graphic 3" o:spid="_x0000_s1026" style="position:absolute;margin-left:55.6pt;margin-top:341.35pt;width:499.65pt;height:.1pt;z-index:251659264;visibility:visible;mso-wrap-style:square;mso-wrap-distance-left:0;mso-wrap-distance-top:0;mso-wrap-distance-right:0;mso-wrap-distance-bottom:0;mso-position-horizontal:absolute;mso-position-horizontal-relative:page;mso-position-vertical:absolute;mso-position-vertical-relative:page;v-text-anchor:top" coordsize="6345555,1270" o:gfxdata="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" path="m,l6345047,e" filled="f" strokeweight=".14033mm">
                 <v:path arrowok="t"/>
                 <w10:wrap anchorx="page" anchory="page"/>
               </v:shape>
@@ -1148,16 +1176,13 @@
         <w:t xml:space="preserve"> </w:t>
       </w:r>
       <w:r>
-        <w:t>Python,</w:t>
-      </w:r>
-      <w:r>
-        <w:rPr>
-          <w:spacing w:val="-4"/>
-        </w:rPr>
-        <w:t xml:space="preserve"> </w:t>
-      </w:r>
-      <w:r>
-        <w:t>TensorFlow/Keras,</w:t>
+        <w:t>Python</w:t>
+      </w:r>
+      <w:r>
+        <w:tab/>
+      </w:r>
+      <w:r>
+        <w:t>,</w:t>
       </w:r>
       <w:r>
         <w:rPr>
@@ -1165,8 +1190,13 @@
         </w:rPr>
         <w:t xml:space="preserve"> </w:t>
       </w:r>
-      <w:r>
-        <w:t>FastAPI,</w:t>
+      <w:proofErr w:type="spellStart"/>
+      <w:r>
+        <w:t>FastAPI</w:t>
+      </w:r>
+      <w:proofErr w:type="spellEnd"/>
+      <w:r>
+        <w:t>,</w:t>
       </w:r>
       <w:r>
         <w:rPr>
@@ -1621,7 +1651,21 @@
         <w:rPr>
           <w:lang w:val="en-US"/>
         </w:rPr>
-        <w:t>Engineered persistent order history via structured localStorage — enabling re-booking of frequent routes, itemized cost comparisons across service tiers, and session-scoped auth with client-side form validation and dark/light mode toggle across mobile and desktop viewports</w:t>
+        <w:t xml:space="preserve">Engineered persistent order history via structured </w:t>
+      </w:r>
+      <w:proofErr w:type="spellStart"/>
+      <w:r>
+        <w:rPr>
+          <w:lang w:val="en-US"/>
+        </w:rPr>
+        <w:t>localStorage</w:t>
+      </w:r>
+      <w:proofErr w:type="spellEnd"/>
+      <w:r>
+        <w:rPr>
+          <w:lang w:val="en-US"/>
+        </w:rPr>
+        <w:t xml:space="preserve"> — enabling re-booking of frequent routes, itemized cost comparisons across service tiers, and session-scoped auth with client-side form validation and dark/light mode toggle across mobile and desktop viewports</w:t>
       </w:r>
     </w:p>
     <w:p/>
@@ -1654,7 +1698,7 @@
         <mc:AlternateContent>
           <mc:Choice Requires="wps">
             <w:drawing>
-              <wp:anchor distT="0" distB="0" distL="0" distR="0" simplePos="0" relativeHeight="251660288" behindDoc="0" locked="0" layoutInCell="1" allowOverlap="1" wp14:anchorId="7CC9997A" wp14:editId="0219A65F">
+              <wp:anchor distT="0" distB="0" distL="0" distR="0" simplePos="0" relativeHeight="251659264" behindDoc="0" locked="0" layoutInCell="1" allowOverlap="1" wp14:anchorId="7CC9997A" wp14:editId="0219A65F">
                 <wp:simplePos x="0" y="0"/>
                 <wp:positionH relativeFrom="page">
                   <wp:posOffset>708660</wp:posOffset>
@@ -1718,7 +1762,7 @@
           </mc:Choice>
           <mc:Fallback>
             <w:pict>
-              <v:shape w14:anchorId="35885C01" id="Graphic 5" o:spid="_x0000_s1026" style="position:absolute;margin-left:55.8pt;margin-top:274.1pt;width:499.65pt;height:.1pt;z-index:251660288;visibility:visible;mso-wrap-style:square;mso-wrap-distance-left:0;mso-wrap-distance-top:0;mso-wrap-distance-right:0;mso-wrap-distance-bottom:0;mso-position-horizontal:absolute;mso-position-horizontal-relative:page;mso-position-vertical:absolute;mso-position-vertical-relative:page;v-text-anchor:top" coordsize="6345555,1270" o:gfxdata="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" path="m,l6345047,e" filled="f" strokeweight=".14033mm">
+              <v:shape w14:anchorId="63BC5A96" id="Graphic 5" o:spid="_x0000_s1026" style="position:absolute;margin-left:55.8pt;margin-top:274.1pt;width:499.65pt;height:.1pt;z-index:251659264;visibility:visible;mso-wrap-style:square;mso-wrap-distance-left:0;mso-wrap-distance-top:0;mso-wrap-distance-right:0;mso-wrap-distance-bottom:0;mso-position-horizontal:absolute;mso-position-horizontal-relative:page;mso-position-vertical:absolute;mso-position-vertical-relative:page;v-text-anchor:top" coordsize="6345555,1270" o:gfxdata="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" path="m,l6345047,e" filled="f" strokeweight=".14033mm">
                 <v:path arrowok="t"/>
                 <w10:wrap anchorx="page" anchory="page"/>
               </v:shape>
@@ -1790,6 +1834,8 @@
           <w:sz w:val="20"/>
         </w:rPr>
       </w:pPr>
+      <w:proofErr w:type="spellStart"/>
+      <w:proofErr w:type="gramStart"/>
       <w:r>
         <w:rPr>
           <w:b/>
@@ -1797,6 +1843,8 @@
         </w:rPr>
         <w:t>B.Tech</w:t>
       </w:r>
+      <w:proofErr w:type="spellEnd"/>
+      <w:proofErr w:type="gramEnd"/>
       <w:r>
         <w:rPr>
           <w:b/>
@@ -2211,7 +2259,7 @@
         <mc:AlternateContent>
           <mc:Choice Requires="wps">
             <w:drawing>
-              <wp:anchor distT="0" distB="0" distL="0" distR="0" simplePos="0" relativeHeight="251665408" behindDoc="0" locked="0" layoutInCell="1" allowOverlap="1" wp14:anchorId="12E1DE9E" wp14:editId="24578B69">
+              <wp:anchor distT="0" distB="0" distL="0" distR="0" simplePos="0" relativeHeight="251664384" behindDoc="0" locked="0" layoutInCell="1" allowOverlap="1" wp14:anchorId="12E1DE9E" wp14:editId="24578B69">
                 <wp:simplePos x="0" y="0"/>
                 <wp:positionH relativeFrom="page">
                   <wp:posOffset>711200</wp:posOffset>
@@ -2275,7 +2323,7 @@
           </mc:Choice>
           <mc:Fallback>
             <w:pict>
-              <v:shape w14:anchorId="2B07A7B4" id="Graphic 6" o:spid="_x0000_s1026" style="position:absolute;margin-left:56pt;margin-top:387.85pt;width:499.65pt;height:.1pt;z-index:251665408;visibility:visible;mso-wrap-style:square;mso-wrap-distance-left:0;mso-wrap-distance-top:0;mso-wrap-distance-right:0;mso-wrap-distance-bottom:0;mso-position-horizontal:absolute;mso-position-horizontal-relative:page;mso-position-vertical:absolute;mso-position-vertical-relative:page;v-text-anchor:top" coordsize="6345555,1270" o:gfxdata="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" path="m,l6345047,e" filled="f" strokeweight=".14033mm">
+              <v:shape w14:anchorId="092F78C2" id="Graphic 6" o:spid="_x0000_s1026" style="position:absolute;margin-left:56pt;margin-top:387.85pt;width:499.65pt;height:.1pt;z-index:251664384;visibility:visible;mso-wrap-style:square;mso-wrap-distance-left:0;mso-wrap-distance-top:0;mso-wrap-distance-right:0;mso-wrap-distance-bottom:0;mso-position-horizontal:absolute;mso-position-horizontal-relative:page;mso-position-vertical:absolute;mso-position-vertical-relative:page;v-text-anchor:top" coordsize="6345555,1270" o:gfxdata="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" path="m,l6345047,e" filled="f" strokeweight=".14033mm">
                 <v:path arrowok="t"/>
                 <w10:wrap anchorx="page" anchory="page"/>
               </v:shape>
@@ -2569,7 +2617,7 @@
         <mc:AlternateContent>
           <mc:Choice Requires="wps">
             <w:drawing>
-              <wp:anchor distT="0" distB="0" distL="0" distR="0" simplePos="0" relativeHeight="251654144" behindDoc="0" locked="0" layoutInCell="1" allowOverlap="1" wp14:anchorId="3D0455E4" wp14:editId="05D1A3FE">
+              <wp:anchor distT="0" distB="0" distL="0" distR="0" simplePos="0" relativeHeight="251653120" behindDoc="0" locked="0" layoutInCell="1" allowOverlap="1" wp14:anchorId="3D0455E4" wp14:editId="05D1A3FE">
                 <wp:simplePos x="0" y="0"/>
                 <wp:positionH relativeFrom="page">
                   <wp:posOffset>708025</wp:posOffset>
@@ -2633,7 +2681,7 @@
           </mc:Choice>
           <mc:Fallback>
             <w:pict>
-              <v:shape w14:anchorId="40B36CDB" id="Graphic 4" o:spid="_x0000_s1026" style="position:absolute;margin-left:55.75pt;margin-top:497.6pt;width:499.65pt;height:.1pt;z-index:251654144;visibility:visible;mso-wrap-style:square;mso-wrap-distance-left:0;mso-wrap-distance-top:0;mso-wrap-distance-right:0;mso-wrap-distance-bottom:0;mso-position-horizontal:absolute;mso-position-horizontal-relative:page;mso-position-vertical:absolute;mso-position-vertical-relative:page;v-text-anchor:top" coordsize="6345555,1270" o:gfxdata="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" path="m,l6345046,e" filled="f" strokeweight=".14033mm">
+              <v:shape w14:anchorId="43A58CC4" id="Graphic 4" o:spid="_x0000_s1026" style="position:absolute;margin-left:55.75pt;margin-top:497.6pt;width:499.65pt;height:.1pt;z-index:251653120;visibility:visible;mso-wrap-style:square;mso-wrap-distance-left:0;mso-wrap-distance-top:0;mso-wrap-distance-right:0;mso-wrap-distance-bottom:0;mso-position-horizontal:absolute;mso-position-horizontal-relative:page;mso-position-vertical:absolute;mso-position-vertical-relative:page;v-text-anchor:top" coordsize="6345555,1270" o:gfxdata="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" path="m,l6345046,e" filled="f" strokeweight=".14033mm">
                 <v:path arrowok="t"/>
                 <w10:wrap anchorx="page" anchory="page"/>
               </v:shape>

</xml_diff>